<commit_message>
build: template master thesis dynamically and update docx files
</commit_message>
<xml_diff>
--- a/docs/a traduire/these/Tese_AI_For_Americans_First_PT-BR.docx
+++ b/docs/a traduire/these/Tese_AI_For_Americans_First_PT-BR.docx
@@ -131,7 +131,7 @@
                 <w:color w:val="1A2744"/>
                 <w:sz w:val="22"/>
               </w:rPr>
-              <w:t>76,9% do compute IA operacional mundial = EUA</w:t>
+              <w:t>78,9% do compute IA operacional mundial = EUA</w:t>
             </w:r>
           </w:p>
         </w:tc>
@@ -173,7 +173,7 @@
                 <w:color w:val="1A2744"/>
                 <w:sz w:val="22"/>
               </w:rPr>
-              <w:t>3,46:1 razao CACI EUA/UE (Power Mode)</w:t>
+              <w:t>3,64:1 razao CACI EUA/UE (Power Mode)</w:t>
             </w:r>
           </w:p>
         </w:tc>
@@ -313,7 +313,7 @@
           <w:color w:val="202020"/>
           <w:sz w:val="22"/>
         </w:rPr>
-        <w:t>Em abril de 2026, os Estados Unidos concentram 76,9% do compute operacional global de IA. A razao bruta de compute instalado EUA/UE e de 17,6:1, que a formula CACI Power Mode traduz em uma vantagem de 3,46:1. Embora a UE mantenha alta soberania sobre sua base fisica instalada (99,2%), sua vulnerabilidade reside na camada operacional de nuvem.</w:t>
+        <w:t>Em abril de 2026, os Estados Unidos concentram 78,9% do compute operacional global de IA. A razao bruta de compute instalado EUA/UE e de 17,6:1, que a formula CACI Power Mode traduz em uma vantagem de 3,64:1. Embora a UE mantenha alta soberania sobre sua base fisica instalada (78,6%), sua vulnerabilidade reside na camada operacional de nuvem.</w:t>
       </w:r>
     </w:p>
     <w:p>

</xml_diff>